<commit_message>
Add multi-robot demo video and update report
- Record TB3_1/TB3_2 velocity mirror demo in turtlebot3_world
- Add video poster and links to report and README
- Regenerate Word report with the new image
</commit_message>
<xml_diff>
--- a/homework/report/report.docx
+++ b/homework/report/report.docx
@@ -6264,6 +6264,68 @@
     </w:p>
     <w:p>
       <w:pPr>
+        <w:jc w:val="center"/>
+      </w:pPr>
+      <w:r>
+        <w:drawing>
+          <wp:inline xmlns:a="http://schemas.openxmlformats.org/drawingml/2006/main" xmlns:pic="http://schemas.openxmlformats.org/drawingml/2006/picture">
+            <wp:extent cx="5486400" cy="3013072"/>
+            <wp:docPr id="15" name="Picture 15"/>
+            <wp:cNvGraphicFramePr>
+              <a:graphicFrameLocks noChangeAspect="1"/>
+            </wp:cNvGraphicFramePr>
+            <a:graphic>
+              <a:graphicData uri="http://schemas.openxmlformats.org/drawingml/2006/picture">
+                <pic:pic>
+                  <pic:nvPicPr>
+                    <pic:cNvPr id="0" name="06_multi_robot_poster.png"/>
+                    <pic:cNvPicPr/>
+                  </pic:nvPicPr>
+                  <pic:blipFill>
+                    <a:blip r:embed="rId23"/>
+                    <a:stretch>
+                      <a:fillRect/>
+                    </a:stretch>
+                  </pic:blipFill>
+                  <pic:spPr>
+                    <a:xfrm>
+                      <a:off x="0" y="0"/>
+                      <a:ext cx="5486400" cy="3013072"/>
+                    </a:xfrm>
+                    <a:prstGeom prst="rect"/>
+                  </pic:spPr>
+                </pic:pic>
+              </a:graphicData>
+            </a:graphic>
+          </wp:inline>
+        </w:drawing>
+      </w:r>
+    </w:p>
+    <w:p>
+      <w:pPr>
+        <w:jc w:val="center"/>
+      </w:pPr>
+      <w:r>
+        <w:rPr>
+          <w:i/>
+          <w:sz w:val="18"/>
+        </w:rPr>
+        <w:t>双车镜像视频截帧（turtlebot3_world）</w:t>
+      </w:r>
+    </w:p>
+    <w:p>
+      <w:r>
+        <w:t xml:space="preserve">▶ 观看双车镜像视频（15 s，turtlebot3_world）  </w:t>
+      </w:r>
+      <w:r>
+        <w:rPr>
+          <w:sz w:val="18"/>
+        </w:rPr>
+        <w:t>../videos/06_multi_robot.mp4</w:t>
+      </w:r>
+    </w:p>
+    <w:p>
+      <w:pPr>
         <w:pStyle w:val="Heading3"/>
       </w:pPr>
       <w:r>
@@ -8513,7 +8575,7 @@
                 <w:rFonts w:ascii="宋体" w:hAnsi="宋体" w:eastAsia="宋体"/>
                 <w:sz w:val="18"/>
               </w:rPr>
-              <w:t>6.9 截图/数据</w:t>
+              <w:t>6.9 截图/视频/数据</w:t>
             </w:r>
           </w:p>
         </w:tc>
@@ -8533,6 +8595,48 @@
                 <w:sz w:val="18"/>
               </w:rPr>
               <w:t>screenshots/06_multi_robot.png</w:t>
+            </w:r>
+            <w:r>
+              <w:rPr>
+                <w:rFonts w:ascii="宋体" w:hAnsi="宋体" w:eastAsia="宋体"/>
+                <w:sz w:val="18"/>
+              </w:rPr>
+              <w:t>、</w:t>
+            </w:r>
+            <w:r>
+              <w:rPr>
+                <w:rFonts w:ascii="Consolas" w:hAnsi="Consolas"/>
+                <w:sz w:val="18"/>
+              </w:rPr>
+              <w:t>videos/06_multi_robot.mp4</w:t>
+            </w:r>
+            <w:r>
+              <w:rPr>
+                <w:rFonts w:ascii="宋体" w:hAnsi="宋体" w:eastAsia="宋体"/>
+                <w:sz w:val="18"/>
+              </w:rPr>
+              <w:t>、</w:t>
+            </w:r>
+            <w:r>
+              <w:rPr>
+                <w:rFonts w:ascii="Consolas" w:hAnsi="Consolas"/>
+                <w:sz w:val="18"/>
+              </w:rPr>
+              <w:t>data/velocity_mirror.log</w:t>
+            </w:r>
+            <w:r>
+              <w:rPr>
+                <w:rFonts w:ascii="宋体" w:hAnsi="宋体" w:eastAsia="宋体"/>
+                <w:sz w:val="18"/>
+              </w:rPr>
+              <w:t>、</w:t>
+            </w:r>
+            <w:r>
+              <w:rPr>
+                <w:rFonts w:ascii="Consolas" w:hAnsi="Consolas"/>
+                <w:sz w:val="18"/>
+              </w:rPr>
+              <w:t>robot_distance.log</w:t>
             </w:r>
           </w:p>
         </w:tc>
@@ -8785,7 +8889,7 @@
                 <w:rFonts w:ascii="宋体" w:hAnsi="宋体" w:eastAsia="宋体"/>
                 <w:sz w:val="18"/>
               </w:rPr>
-              <w:t>（画圆、闭环正方形、建图片段、完整建图加速版、Nav2 导航）</w:t>
+              <w:t>（画圆、闭环正方形、建图片段、完整建图加速版、Nav2 导航、双车镜像）</w:t>
             </w:r>
           </w:p>
         </w:tc>

</xml_diff>